<commit_message>
Added one more image in screenshots in project submission P2-001
</commit_message>
<xml_diff>
--- a/submissions/project-build/ms-copilot-studio/taniya-gupta/p2-001-nova-hr-assist/screenshots.docx
+++ b/submissions/project-build/ms-copilot-studio/taniya-gupta/p2-001-nova-hr-assist/screenshots.docx
@@ -1543,6 +1543,42 @@
               </a:graphicData>
             </a:graphic>
           </wp:anchor>
+        </w:drawing>
+      </w:r>
+    </w:p>
+    <w:p>
+      <w:r>
+        <w:drawing>
+          <wp:inline>
+            <wp:extent cx="5486400" cy="3396853"/>
+            <wp:docPr id="10" name="Picture 10"/>
+            <wp:cNvGraphicFramePr>
+              <a:graphicFrameLocks noChangeAspect="1"/>
+            </wp:cNvGraphicFramePr>
+            <a:graphic>
+              <a:graphicData uri="http://schemas.openxmlformats.org/drawingml/2006/picture">
+                <pic:pic>
+                  <pic:nvPicPr>
+                    <pic:cNvPr id="0" name="media__1784882808335.png"/>
+                    <pic:cNvPicPr/>
+                  </pic:nvPicPr>
+                  <pic:blipFill>
+                    <a:blip r:embed="rId14"/>
+                    <a:stretch>
+                      <a:fillRect/>
+                    </a:stretch>
+                  </pic:blipFill>
+                  <pic:spPr>
+                    <a:xfrm>
+                      <a:off x="0" y="0"/>
+                      <a:ext cx="5486400" cy="3396853"/>
+                    </a:xfrm>
+                    <a:prstGeom prst="rect"/>
+                  </pic:spPr>
+                </pic:pic>
+              </a:graphicData>
+            </a:graphic>
+          </wp:inline>
         </w:drawing>
       </w:r>
     </w:p>

</xml_diff>